<commit_message>
Set the resume at 10.5pt and fill pages with spacing, not larger type
- Body type fixed at 10.5pt; vertical spacing stretches up to 2.2x to fill
  each page, so bullets stop ending on a lone word at 11pt
- Name 18pt; text-wrap: pretty on bullets and skills lines
- docx: font table declares Lato as a sans so machines without it do not
  fall back to Times; body lines use the PDF's 1.18 line height and fixed
  spacing, so all ten variants match their page targets in Word
</commit_message>
<xml_diff>
--- a/resume/roles/ai-software-engineer/Archit_Agrawal_AI_Software_Engineer.docx
+++ b/resume/roles/ai-software-engineer/Archit_Agrawal_AI_Software_Engineer.docx
@@ -10,8 +10,8 @@
       <w:r>
         <w:rPr>
           <w:rFonts w:ascii="Lato" w:hAnsi="Lato" w:cs="Lato"/>
-          <w:sz w:val="30"/>
-          <w:szCs w:val="30"/>
+          <w:sz w:val="36"/>
+          <w:szCs w:val="36"/>
           <w:color w:val="111111"/>
         </w:rPr>
         <w:t xml:space="preserve">ARCHIT AGRAWAL</w:t>
@@ -132,7 +132,7 @@
         <w:pBdr>
           <w:bottom w:val="single" w:sz="4" w:space="1" w:color="999999"/>
         </w:pBdr>
-        <w:spacing w:before="140" w:after="40" w:line="240" w:lineRule="auto"/>
+        <w:spacing w:before="120" w:after="40" w:line="240" w:lineRule="auto"/>
       </w:pPr>
       <w:r>
         <w:rPr>
@@ -151,7 +151,7 @@
         <w:tabs>
           <w:tab w:val="right" w:pos="10656"/>
         </w:tabs>
-        <w:spacing w:before="80" w:after="0" w:line="240" w:lineRule="auto"/>
+        <w:spacing w:before="60" w:after="0" w:line="248" w:lineRule="exact"/>
       </w:pPr>
       <w:r>
         <w:rPr>
@@ -183,7 +183,7 @@
         <w:tabs>
           <w:tab w:val="right" w:pos="10656"/>
         </w:tabs>
-        <w:spacing w:before="0" w:after="10" w:line="240" w:lineRule="auto"/>
+        <w:spacing w:before="0" w:after="10" w:line="248" w:lineRule="exact"/>
       </w:pPr>
       <w:r>
         <w:rPr>
@@ -211,7 +211,7 @@
     </w:p>
     <w:p>
       <w:pPr>
-        <w:spacing w:before="0" w:after="10" w:line="240" w:lineRule="auto"/>
+        <w:spacing w:before="0" w:after="10" w:line="248" w:lineRule="exact"/>
         <w:ind w:left="200" w:hanging="200"/>
       </w:pPr>
       <w:r>
@@ -244,7 +244,7 @@
     </w:p>
     <w:p>
       <w:pPr>
-        <w:spacing w:before="0" w:after="10" w:line="240" w:lineRule="auto"/>
+        <w:spacing w:before="0" w:after="10" w:line="248" w:lineRule="exact"/>
         <w:ind w:left="200" w:hanging="200"/>
       </w:pPr>
       <w:r>
@@ -277,7 +277,7 @@
     </w:p>
     <w:p>
       <w:pPr>
-        <w:spacing w:before="0" w:after="10" w:line="240" w:lineRule="auto"/>
+        <w:spacing w:before="0" w:after="10" w:line="248" w:lineRule="exact"/>
         <w:ind w:left="200" w:hanging="200"/>
       </w:pPr>
       <w:r>
@@ -310,7 +310,7 @@
     </w:p>
     <w:p>
       <w:pPr>
-        <w:spacing w:before="0" w:after="10" w:line="240" w:lineRule="auto"/>
+        <w:spacing w:before="0" w:after="10" w:line="248" w:lineRule="exact"/>
         <w:ind w:left="200" w:hanging="200"/>
       </w:pPr>
       <w:r>
@@ -347,7 +347,7 @@
         <w:tabs>
           <w:tab w:val="right" w:pos="10656"/>
         </w:tabs>
-        <w:spacing w:before="80" w:after="0" w:line="240" w:lineRule="auto"/>
+        <w:spacing w:before="60" w:after="0" w:line="248" w:lineRule="exact"/>
       </w:pPr>
       <w:r>
         <w:rPr>
@@ -379,7 +379,7 @@
         <w:tabs>
           <w:tab w:val="right" w:pos="10656"/>
         </w:tabs>
-        <w:spacing w:before="0" w:after="10" w:line="240" w:lineRule="auto"/>
+        <w:spacing w:before="0" w:after="10" w:line="248" w:lineRule="exact"/>
       </w:pPr>
       <w:r>
         <w:rPr>
@@ -407,7 +407,7 @@
     </w:p>
     <w:p>
       <w:pPr>
-        <w:spacing w:before="0" w:after="10" w:line="240" w:lineRule="auto"/>
+        <w:spacing w:before="0" w:after="10" w:line="248" w:lineRule="exact"/>
         <w:ind w:left="200" w:hanging="200"/>
       </w:pPr>
       <w:r>
@@ -440,7 +440,7 @@
     </w:p>
     <w:p>
       <w:pPr>
-        <w:spacing w:before="0" w:after="10" w:line="240" w:lineRule="auto"/>
+        <w:spacing w:before="0" w:after="10" w:line="248" w:lineRule="exact"/>
         <w:ind w:left="200" w:hanging="200"/>
       </w:pPr>
       <w:r>
@@ -477,7 +477,7 @@
         <w:tabs>
           <w:tab w:val="right" w:pos="10656"/>
         </w:tabs>
-        <w:spacing w:before="80" w:after="0" w:line="240" w:lineRule="auto"/>
+        <w:spacing w:before="60" w:after="0" w:line="248" w:lineRule="exact"/>
       </w:pPr>
       <w:r>
         <w:rPr>
@@ -509,7 +509,7 @@
         <w:tabs>
           <w:tab w:val="right" w:pos="10656"/>
         </w:tabs>
-        <w:spacing w:before="0" w:after="10" w:line="240" w:lineRule="auto"/>
+        <w:spacing w:before="0" w:after="10" w:line="248" w:lineRule="exact"/>
       </w:pPr>
       <w:r>
         <w:rPr>
@@ -537,7 +537,7 @@
     </w:p>
     <w:p>
       <w:pPr>
-        <w:spacing w:before="0" w:after="10" w:line="240" w:lineRule="auto"/>
+        <w:spacing w:before="0" w:after="10" w:line="248" w:lineRule="exact"/>
         <w:ind w:left="200" w:hanging="200"/>
       </w:pPr>
       <w:r>
@@ -570,7 +570,7 @@
     </w:p>
     <w:p>
       <w:pPr>
-        <w:spacing w:before="0" w:after="10" w:line="240" w:lineRule="auto"/>
+        <w:spacing w:before="0" w:after="10" w:line="248" w:lineRule="exact"/>
         <w:ind w:left="200" w:hanging="200"/>
       </w:pPr>
       <w:r>
@@ -607,7 +607,7 @@
         <w:tabs>
           <w:tab w:val="right" w:pos="10656"/>
         </w:tabs>
-        <w:spacing w:before="80" w:after="0" w:line="240" w:lineRule="auto"/>
+        <w:spacing w:before="60" w:after="0" w:line="248" w:lineRule="exact"/>
       </w:pPr>
       <w:r>
         <w:rPr>
@@ -639,7 +639,7 @@
         <w:tabs>
           <w:tab w:val="right" w:pos="10656"/>
         </w:tabs>
-        <w:spacing w:before="0" w:after="10" w:line="240" w:lineRule="auto"/>
+        <w:spacing w:before="0" w:after="10" w:line="248" w:lineRule="exact"/>
       </w:pPr>
       <w:r>
         <w:rPr>
@@ -667,7 +667,7 @@
     </w:p>
     <w:p>
       <w:pPr>
-        <w:spacing w:before="0" w:after="10" w:line="240" w:lineRule="auto"/>
+        <w:spacing w:before="0" w:after="10" w:line="248" w:lineRule="exact"/>
         <w:ind w:left="200" w:hanging="200"/>
       </w:pPr>
       <w:r>
@@ -704,7 +704,7 @@
         <w:tabs>
           <w:tab w:val="right" w:pos="10656"/>
         </w:tabs>
-        <w:spacing w:before="80" w:after="0" w:line="240" w:lineRule="auto"/>
+        <w:spacing w:before="60" w:after="0" w:line="248" w:lineRule="exact"/>
       </w:pPr>
       <w:r>
         <w:rPr>
@@ -736,7 +736,7 @@
         <w:tabs>
           <w:tab w:val="right" w:pos="10656"/>
         </w:tabs>
-        <w:spacing w:before="0" w:after="10" w:line="240" w:lineRule="auto"/>
+        <w:spacing w:before="0" w:after="10" w:line="248" w:lineRule="exact"/>
       </w:pPr>
       <w:r>
         <w:rPr>
@@ -764,7 +764,7 @@
     </w:p>
     <w:p>
       <w:pPr>
-        <w:spacing w:before="0" w:after="10" w:line="240" w:lineRule="auto"/>
+        <w:spacing w:before="0" w:after="10" w:line="248" w:lineRule="exact"/>
         <w:ind w:left="200" w:hanging="200"/>
       </w:pPr>
       <w:r>
@@ -801,7 +801,7 @@
         <w:tabs>
           <w:tab w:val="right" w:pos="10656"/>
         </w:tabs>
-        <w:spacing w:before="80" w:after="0" w:line="240" w:lineRule="auto"/>
+        <w:spacing w:before="60" w:after="0" w:line="248" w:lineRule="exact"/>
       </w:pPr>
       <w:r>
         <w:rPr>
@@ -833,7 +833,7 @@
         <w:tabs>
           <w:tab w:val="right" w:pos="10656"/>
         </w:tabs>
-        <w:spacing w:before="0" w:after="10" w:line="240" w:lineRule="auto"/>
+        <w:spacing w:before="0" w:after="10" w:line="248" w:lineRule="exact"/>
       </w:pPr>
       <w:r>
         <w:rPr>
@@ -861,7 +861,7 @@
     </w:p>
     <w:p>
       <w:pPr>
-        <w:spacing w:before="0" w:after="10" w:line="240" w:lineRule="auto"/>
+        <w:spacing w:before="0" w:after="10" w:line="248" w:lineRule="exact"/>
         <w:ind w:left="200" w:hanging="200"/>
       </w:pPr>
       <w:r>
@@ -898,7 +898,7 @@
         <w:pBdr>
           <w:bottom w:val="single" w:sz="4" w:space="1" w:color="999999"/>
         </w:pBdr>
-        <w:spacing w:before="140" w:after="40" w:line="240" w:lineRule="auto"/>
+        <w:spacing w:before="120" w:after="40" w:line="240" w:lineRule="auto"/>
       </w:pPr>
       <w:r>
         <w:rPr>
@@ -917,7 +917,7 @@
         <w:tabs>
           <w:tab w:val="right" w:pos="10656"/>
         </w:tabs>
-        <w:spacing w:before="80" w:after="0" w:line="240" w:lineRule="auto"/>
+        <w:spacing w:before="60" w:after="0" w:line="248" w:lineRule="exact"/>
       </w:pPr>
       <w:r>
         <w:rPr>
@@ -945,7 +945,7 @@
     </w:p>
     <w:p>
       <w:pPr>
-        <w:spacing w:before="0" w:after="10" w:line="240" w:lineRule="auto"/>
+        <w:spacing w:before="0" w:after="10" w:line="248" w:lineRule="exact"/>
         <w:ind w:left="200" w:hanging="200"/>
       </w:pPr>
       <w:r>
@@ -982,7 +982,7 @@
         <w:pBdr>
           <w:bottom w:val="single" w:sz="4" w:space="1" w:color="999999"/>
         </w:pBdr>
-        <w:spacing w:before="140" w:after="40" w:line="240" w:lineRule="auto"/>
+        <w:spacing w:before="120" w:after="40" w:line="240" w:lineRule="auto"/>
       </w:pPr>
       <w:r>
         <w:rPr>
@@ -997,7 +997,7 @@
     </w:p>
     <w:p>
       <w:pPr>
-        <w:spacing w:before="0" w:after="10" w:line="240" w:lineRule="auto"/>
+        <w:spacing w:before="0" w:after="10" w:line="248" w:lineRule="exact"/>
       </w:pPr>
       <w:r>
         <w:rPr>
@@ -1021,7 +1021,7 @@
     </w:p>
     <w:p>
       <w:pPr>
-        <w:spacing w:before="0" w:after="10" w:line="240" w:lineRule="auto"/>
+        <w:spacing w:before="0" w:after="10" w:line="248" w:lineRule="exact"/>
       </w:pPr>
       <w:r>
         <w:rPr>
@@ -1045,7 +1045,7 @@
     </w:p>
     <w:p>
       <w:pPr>
-        <w:spacing w:before="0" w:after="10" w:line="240" w:lineRule="auto"/>
+        <w:spacing w:before="0" w:after="10" w:line="248" w:lineRule="exact"/>
       </w:pPr>
       <w:r>
         <w:rPr>
@@ -1073,7 +1073,7 @@
         <w:pBdr>
           <w:bottom w:val="single" w:sz="4" w:space="1" w:color="999999"/>
         </w:pBdr>
-        <w:spacing w:before="140" w:after="40" w:line="240" w:lineRule="auto"/>
+        <w:spacing w:before="120" w:after="40" w:line="240" w:lineRule="auto"/>
       </w:pPr>
       <w:r>
         <w:rPr>
@@ -1092,7 +1092,7 @@
         <w:tabs>
           <w:tab w:val="right" w:pos="10656"/>
         </w:tabs>
-        <w:spacing w:before="80" w:after="0" w:line="240" w:lineRule="auto"/>
+        <w:spacing w:before="60" w:after="0" w:line="248" w:lineRule="exact"/>
       </w:pPr>
       <w:r>
         <w:rPr>
@@ -1123,7 +1123,7 @@
         <w:tabs>
           <w:tab w:val="right" w:pos="10656"/>
         </w:tabs>
-        <w:spacing w:before="0" w:after="10" w:line="240" w:lineRule="auto"/>
+        <w:spacing w:before="0" w:after="10" w:line="248" w:lineRule="exact"/>
       </w:pPr>
       <w:r>
         <w:rPr>
@@ -1155,7 +1155,7 @@
         <w:tabs>
           <w:tab w:val="right" w:pos="10656"/>
         </w:tabs>
-        <w:spacing w:before="80" w:after="0" w:line="240" w:lineRule="auto"/>
+        <w:spacing w:before="60" w:after="0" w:line="248" w:lineRule="exact"/>
       </w:pPr>
       <w:r>
         <w:rPr>
@@ -1186,7 +1186,7 @@
         <w:tabs>
           <w:tab w:val="right" w:pos="10656"/>
         </w:tabs>
-        <w:spacing w:before="0" w:after="10" w:line="240" w:lineRule="auto"/>
+        <w:spacing w:before="0" w:after="10" w:line="248" w:lineRule="exact"/>
       </w:pPr>
       <w:r>
         <w:rPr>

</xml_diff>